<commit_message>
docs(phase1): adapt Fix and Go proposal and evidence to academic MVP
</commit_message>
<xml_diff>
--- a/APT122_005D/Equipo_Por_Definir/Fase_1/Evidencias_Individuales/Olmedo_Benjamin/Olmedo_Benjamin_1.1_APT122_AutoevaluacionCompetenciasFase1.docx
+++ b/APT122_005D/Equipo_Por_Definir/Fase_1/Evidencias_Individuales/Olmedo_Benjamin/Olmedo_Benjamin_1.1_APT122_AutoevaluacionCompetenciasFase1.docx
@@ -1689,7 +1689,7 @@
                 <w:color w:val="000000"/>
                 <w:sz w:val="16"/>
               </w:rPr>
-              <w:t>Es una de mis principales fortalezas. Me siento seguro construyendo interfaces y funcionalidades, especialmente para entornos web y móviles.</w:t>
+              <w:t>Es una de mis principales fortalezas. Me siento seguro construyendo interfaces y funcionalidades, especialmente para entornos web responsive para computadores y teléfonoses.</w:t>
             </w:r>
           </w:p>
         </w:tc>
@@ -1997,7 +1997,15 @@
                 <w:color w:val="000000"/>
                 <w:sz w:val="16"/>
               </w:rPr>
-              <w:t>Realizo verificaciones funcionales, pero necesito fortalecer automatización, cobertura y documentación sistemática de pruebas.</w:t>
+            </w:r>
+            <w:r>
+              <w:rPr>
+                <w:rFonts w:ascii="Calibri" w:hAnsi="Calibri"/>
+                <w:b w:val="0"/>
+                <w:color w:val="000000"/>
+                <w:sz w:val="16"/>
+              </w:rPr>
+              <w:t xml:space="preserve">Realizo verificaciones funcionales, pero necesito fortalecer automatización y documentación de pruebas. En FIX&amp;GO registraré casos de solicitud, permisos y cierre, con resultados vinculados a la versión evaluada.</w:t>
             </w:r>
           </w:p>
         </w:tc>
@@ -2619,26 +2627,6 @@
         </w:tc>
       </w:tr>
     </w:tbl>
-    <w:p>
-      <w:pPr>
-        <w:pStyle w:val="Prrafodelista"/>
-        <w:ind w:left="435"/>
-        <w:rPr>
-          <w:rFonts w:cstheme="minorHAnsi"/>
-          <w:sz w:val="20"/>
-          <w:szCs w:val="20"/>
-        </w:rPr>
-      </w:pPr>
-    </w:p>
-    <w:p>
-      <w:pPr>
-        <w:rPr>
-          <w:rFonts w:cstheme="minorHAnsi"/>
-          <w:sz w:val="20"/>
-          <w:szCs w:val="20"/>
-        </w:rPr>
-      </w:pPr>
-    </w:p>
     <w:sectPr>
       <w:headerReference w:type="even" r:id="rId11"/>
       <w:headerReference w:type="default" r:id="rId12"/>

</xml_diff>

<commit_message>
docs: align Benjamin self-assessment and reflection with graduate profile
</commit_message>
<xml_diff>
--- a/APT122_005D/Equipo_Por_Definir/Fase_1/Evidencias_Individuales/Olmedo_Benjamin/Olmedo_Benjamin_1.1_APT122_AutoevaluacionCompetenciasFase1.docx
+++ b/APT122_005D/Equipo_Por_Definir/Fase_1/Evidencias_Individuales/Olmedo_Benjamin/Olmedo_Benjamin_1.1_APT122_AutoevaluacionCompetenciasFase1.docx
@@ -1096,6 +1096,8 @@
         <w:trPr>
           <w:trHeight w:val="288"/>
           <w:jc w:val="center"/>
+          <w:cantSplit/>
+          <w:tblHeader/>
         </w:trPr>
         <w:tc>
           <w:tcPr>
@@ -1204,6 +1206,8 @@
         <w:trPr>
           <w:trHeight w:val="870"/>
           <w:jc w:val="center"/>
+          <w:cantSplit/>
+          <w:tblHeader/>
         </w:trPr>
         <w:tc>
           <w:tcPr>
@@ -1390,6 +1394,7 @@
         <w:trPr>
           <w:trHeight w:val="591"/>
           <w:jc w:val="center"/>
+          <w:cantSplit/>
         </w:trPr>
         <w:tc>
           <w:tcPr>
@@ -1400,7 +1405,6 @@
             <w:pPr>
               <w:spacing w:before="0" w:after="0"/>
             </w:pPr>
-            <w:r/>
             <w:r>
               <w:rPr>
                 <w:rFonts w:ascii="Calibri" w:hAnsi="Calibri"/>
@@ -1408,7 +1412,7 @@
                 <w:color w:val="1F7A4F"/>
                 <w:sz w:val="16"/>
               </w:rPr>
-              <w:t>Analizar procesos y proponer soluciones informáticas</w:t>
+              <w:t>Ofrecer propuestas de solución informática analizando de forma integral los procesos de acuerdo a los requerimientos de la organización.</w:t>
             </w:r>
           </w:p>
         </w:tc>
@@ -1527,7 +1531,6 @@
             <w:pPr>
               <w:spacing w:before="0" w:after="0"/>
             </w:pPr>
-            <w:r/>
             <w:r>
               <w:rPr>
                 <w:rFonts w:ascii="Calibri" w:hAnsi="Calibri"/>
@@ -1535,7 +1538,7 @@
                 <w:color w:val="000000"/>
                 <w:sz w:val="16"/>
               </w:rPr>
-              <w:t>Puedo comprender necesidades y proponer soluciones creativas; debo reforzar la validación formal de requisitos con usuarios.</w:t>
+              <w:t>Puedo comprender necesidades y proponer soluciones informáticas. Debo fortalecer la validación formal de requisitos. En FIX&amp;GO revisaré la factibilidad técnica del recorrido cliente–prestador y sus criterios de aceptación.</w:t>
             </w:r>
           </w:p>
         </w:tc>
@@ -1544,6 +1547,7 @@
         <w:trPr>
           <w:trHeight w:val="576"/>
           <w:jc w:val="center"/>
+          <w:cantSplit/>
         </w:trPr>
         <w:tc>
           <w:tcPr>
@@ -1554,7 +1558,6 @@
             <w:pPr>
               <w:spacing w:before="0" w:after="0"/>
             </w:pPr>
-            <w:r/>
             <w:r>
               <w:rPr>
                 <w:rFonts w:ascii="Calibri" w:hAnsi="Calibri"/>
@@ -1562,7 +1565,7 @@
                 <w:color w:val="1F7A4F"/>
                 <w:sz w:val="16"/>
               </w:rPr>
-              <w:t>Desarrollar soluciones de software</w:t>
+              <w:t>Desarrollar una solución de software utilizando técnicas que permitan sistematizar el proceso de desarrollo y mantenimiento, asegurando el logro de los objetivos.</w:t>
             </w:r>
           </w:p>
         </w:tc>
@@ -1681,7 +1684,6 @@
             <w:pPr>
               <w:spacing w:before="0" w:after="0"/>
             </w:pPr>
-            <w:r/>
             <w:r>
               <w:rPr>
                 <w:rFonts w:ascii="Calibri" w:hAnsi="Calibri"/>
@@ -1689,7 +1691,7 @@
                 <w:color w:val="000000"/>
                 <w:sz w:val="16"/>
               </w:rPr>
-              <w:t>Es una de mis principales fortalezas. Me siento seguro construyendo interfaces y funcionalidades, especialmente para entornos web responsive para computadores y teléfonoses.</w:t>
+              <w:t>El desarrollo de software es una de mis fortalezas. Me siento seguro construyendo interfaces y funcionalidades y conozco Django. En FIX&amp;GO asumiré app móvil, API e integración; necesito consolidar el uso de Expo en iOS y Android.</w:t>
             </w:r>
           </w:p>
         </w:tc>
@@ -1698,6 +1700,7 @@
         <w:trPr>
           <w:trHeight w:val="591"/>
           <w:jc w:val="center"/>
+          <w:cantSplit/>
         </w:trPr>
         <w:tc>
           <w:tcPr>
@@ -1708,7 +1711,6 @@
             <w:pPr>
               <w:spacing w:before="0" w:after="0"/>
             </w:pPr>
-            <w:r/>
             <w:r>
               <w:rPr>
                 <w:rFonts w:ascii="Calibri" w:hAnsi="Calibri"/>
@@ -1716,7 +1718,7 @@
                 <w:color w:val="1F7A4F"/>
                 <w:sz w:val="16"/>
               </w:rPr>
-              <w:t>Construir programas usando buenas prácticas</w:t>
+              <w:t>Construir programas y rutinas de variada complejidad para dar solución a requerimientos de la organización, acordes a tecnologías de mercado y utilizando buenas prácticas de codificación.</w:t>
             </w:r>
           </w:p>
         </w:tc>
@@ -1835,7 +1837,6 @@
             <w:pPr>
               <w:spacing w:before="0" w:after="0"/>
             </w:pPr>
-            <w:r/>
             <w:r>
               <w:rPr>
                 <w:rFonts w:ascii="Calibri" w:hAnsi="Calibri"/>
@@ -1843,7 +1844,7 @@
                 <w:color w:val="000000"/>
                 <w:sz w:val="16"/>
               </w:rPr>
-              <w:t>Puedo transformar requerimientos en código funcional y organizado; todavía puedo profundizar en patrones y mantenibilidad a gran escala.</w:t>
+              <w:t>Puedo transformar requisitos en código funcional y organizado. Quiero fortalecer mantenibilidad, manejo de errores y separación de responsabilidades al implementar el recorrido de contratación.</w:t>
             </w:r>
           </w:p>
         </w:tc>
@@ -1852,6 +1853,7 @@
         <w:trPr>
           <w:trHeight w:val="591"/>
           <w:jc w:val="center"/>
+          <w:cantSplit/>
         </w:trPr>
         <w:tc>
           <w:tcPr>
@@ -1862,7 +1864,6 @@
             <w:pPr>
               <w:spacing w:before="0" w:after="0"/>
             </w:pPr>
-            <w:r/>
             <w:r>
               <w:rPr>
                 <w:rFonts w:ascii="Calibri" w:hAnsi="Calibri"/>
@@ -1870,7 +1871,7 @@
                 <w:color w:val="C00000"/>
                 <w:sz w:val="16"/>
               </w:rPr>
-              <w:t>Realizar pruebas de productos y procesos</w:t>
+              <w:t>Realizar pruebas de certificación tanto de los productos como de los procesos utilizando buenas prácticas definidas por la industria</w:t>
             </w:r>
           </w:p>
         </w:tc>
@@ -1989,7 +1990,6 @@
             <w:pPr>
               <w:spacing w:before="0" w:after="0"/>
             </w:pPr>
-            <w:r/>
             <w:r>
               <w:rPr>
                 <w:rFonts w:ascii="Calibri" w:hAnsi="Calibri"/>
@@ -1997,15 +1997,7 @@
                 <w:color w:val="000000"/>
                 <w:sz w:val="16"/>
               </w:rPr>
-            </w:r>
-            <w:r>
-              <w:rPr>
-                <w:rFonts w:ascii="Calibri" w:hAnsi="Calibri"/>
-                <w:b w:val="0"/>
-                <w:color w:val="000000"/>
-                <w:sz w:val="16"/>
-              </w:rPr>
-              <w:t xml:space="preserve">Realizo verificaciones funcionales, pero necesito fortalecer automatización y documentación de pruebas. En FIX&amp;GO registraré casos de solicitud, permisos y cierre, con resultados vinculados a la versión evaluada.</w:t>
+              <w:t>Realizo verificaciones funcionales, pero necesito reforzar pruebas automatizadas y registro de resultados. En FIX&amp;GO comprobaré permisos, estados, persistencia e integración; las pruebas se documentarán cuando se ejecuten.</w:t>
             </w:r>
           </w:p>
         </w:tc>
@@ -2014,6 +2006,7 @@
         <w:trPr>
           <w:trHeight w:val="591"/>
           <w:jc w:val="center"/>
+          <w:cantSplit/>
         </w:trPr>
         <w:tc>
           <w:tcPr>
@@ -2024,7 +2017,6 @@
             <w:pPr>
               <w:spacing w:before="0" w:after="0"/>
             </w:pPr>
-            <w:r/>
             <w:r>
               <w:rPr>
                 <w:rFonts w:ascii="Calibri" w:hAnsi="Calibri"/>
@@ -2032,7 +2024,7 @@
                 <w:color w:val="C00000"/>
                 <w:sz w:val="16"/>
               </w:rPr>
-              <w:t>Construir modelos arquitectónicos de soluciones</w:t>
+              <w:t>Construir el modelo arquitectónico de una solución sistémica que soporte los procesos de negocio de acuerdo los requerimientos de la organización y estándares industria.</w:t>
             </w:r>
           </w:p>
         </w:tc>
@@ -2151,7 +2143,6 @@
             <w:pPr>
               <w:spacing w:before="0" w:after="0"/>
             </w:pPr>
-            <w:r/>
             <w:r>
               <w:rPr>
                 <w:rFonts w:ascii="Calibri" w:hAnsi="Calibri"/>
@@ -2159,7 +2150,7 @@
                 <w:color w:val="000000"/>
                 <w:sz w:val="16"/>
               </w:rPr>
-              <w:t>Comprendo la separación de componentes y responsabilidades, aunque necesito más experiencia diseñando arquitecturas escalables y seguras.</w:t>
+              <w:t>Comprendo la separación de componentes, aunque necesito más práctica en arquitectura y seguridad. Modelaré una app móvil conectada a una API monolítica y una base local, con despliegue reproducible mediante Docker.</w:t>
             </w:r>
           </w:p>
         </w:tc>
@@ -2168,6 +2159,7 @@
         <w:trPr>
           <w:trHeight w:val="576"/>
           <w:jc w:val="center"/>
+          <w:cantSplit/>
         </w:trPr>
         <w:tc>
           <w:tcPr>
@@ -2178,7 +2170,6 @@
             <w:pPr>
               <w:spacing w:before="0" w:after="0"/>
             </w:pPr>
-            <w:r/>
             <w:r>
               <w:rPr>
                 <w:rFonts w:ascii="Calibri" w:hAnsi="Calibri"/>
@@ -2186,7 +2177,7 @@
                 <w:color w:val="1F7A4F"/>
                 <w:sz w:val="16"/>
               </w:rPr>
-              <w:t>Gestionar proyectos informáticos</w:t>
+              <w:t>Gestionar proyectos informáticos, ofreciendo alternativas para la toma de decisiones de acuerdo a los requerimientos de la organización.</w:t>
             </w:r>
           </w:p>
         </w:tc>
@@ -2305,7 +2296,6 @@
             <w:pPr>
               <w:spacing w:before="0" w:after="0"/>
             </w:pPr>
-            <w:r/>
             <w:r>
               <w:rPr>
                 <w:rFonts w:ascii="Calibri" w:hAnsi="Calibri"/>
@@ -2313,7 +2303,7 @@
                 <w:color w:val="000000"/>
                 <w:sz w:val="16"/>
               </w:rPr>
-              <w:t>Me interesa especialmente planificar, coordinar personas y tomar decisiones. He aplicado Scrum y trabajo colaborativo en proyectos académicos.</w:t>
+              <w:t>Me interesa planificar, coordinar personas y tomar decisiones; he trabajado con Scrum en proyectos académicos. En este proyecto organizaré mis tareas técnicas con Daniel, quien llevará la gestión y documentación, ajustando el alcance a mi disponibilidad.</w:t>
             </w:r>
           </w:p>
         </w:tc>
@@ -2322,6 +2312,7 @@
         <w:trPr>
           <w:trHeight w:val="591"/>
           <w:jc w:val="center"/>
+          <w:cantSplit/>
         </w:trPr>
         <w:tc>
           <w:tcPr>
@@ -2332,7 +2323,6 @@
             <w:pPr>
               <w:spacing w:before="0" w:after="0"/>
             </w:pPr>
-            <w:r/>
             <w:r>
               <w:rPr>
                 <w:rFonts w:ascii="Calibri" w:hAnsi="Calibri"/>
@@ -2340,7 +2330,7 @@
                 <w:color w:val="1F7A4F"/>
                 <w:sz w:val="16"/>
               </w:rPr>
-              <w:t>Comunicarse en inglés en contextos laborales</w:t>
+              <w:t>Comunicarse usando el idioma inglés en situaciones laborales a un nivel intermedio relacionado con su área de especialización, según la Tabla de Competencias TOEIC y CEFR.</w:t>
             </w:r>
           </w:p>
         </w:tc>
@@ -2459,7 +2449,6 @@
             <w:pPr>
               <w:spacing w:before="0" w:after="0"/>
             </w:pPr>
-            <w:r/>
             <w:r>
               <w:rPr>
                 <w:rFonts w:ascii="Calibri" w:hAnsi="Calibri"/>
@@ -2467,7 +2456,7 @@
                 <w:color w:val="000000"/>
                 <w:sz w:val="16"/>
               </w:rPr>
-              <w:t>Puedo comprender documentación y comunicar ideas técnicas en inglés; continuaré ampliando vocabulario profesional y fluidez oral.</w:t>
+              <w:t>Puedo comprender documentación y comunicar ideas técnicas en inglés. Continuaré fortaleciendo vocabulario profesional y fluidez al consultar documentación y explicar decisiones de implementación.</w:t>
             </w:r>
           </w:p>
         </w:tc>
@@ -2476,6 +2465,7 @@
         <w:trPr>
           <w:trHeight w:val="576"/>
           <w:jc w:val="center"/>
+          <w:cantSplit/>
         </w:trPr>
         <w:tc>
           <w:tcPr>
@@ -2486,7 +2476,6 @@
             <w:pPr>
               <w:spacing w:before="0" w:after="0"/>
             </w:pPr>
-            <w:r/>
             <w:r>
               <w:rPr>
                 <w:rFonts w:ascii="Calibri" w:hAnsi="Calibri"/>
@@ -2494,7 +2483,7 @@
                 <w:color w:val="1F7A4F"/>
                 <w:sz w:val="16"/>
               </w:rPr>
-              <w:t>Elaborar proyectos innovadores que agreguen valor</w:t>
+              <w:t>Elaborar proyectos innovadores que agreguen valor a contextos sociales y productivos, de acuerdo a las necesidades del entorno.</w:t>
             </w:r>
           </w:p>
         </w:tc>
@@ -2613,7 +2602,6 @@
             <w:pPr>
               <w:spacing w:before="0" w:after="0"/>
             </w:pPr>
-            <w:r/>
             <w:r>
               <w:rPr>
                 <w:rFonts w:ascii="Calibri" w:hAnsi="Calibri"/>
@@ -2621,7 +2609,7 @@
                 <w:color w:val="000000"/>
                 <w:sz w:val="16"/>
               </w:rPr>
-              <w:t>La creatividad y la visión de producto son fortalezas que quiero convertir en emprendimientos tecnológicos sostenibles y útiles.</w:t>
+              <w:t>La creatividad y la visión de producto son fortalezas que quiero orientar al emprendimiento. FIX&amp;GO me permitirá convertir una necesidad cotidiana en un MVP y evaluar su utilidad sin confundir pruebas exploratorias con validación comercial.</w:t>
             </w:r>
           </w:p>
         </w:tc>

</xml_diff>